<commit_message>
Resume data in uypdate Siklle data
</commit_message>
<xml_diff>
--- a/Resume/3.docx
+++ b/Resume/3.docx
@@ -1,6 +1,6 @@
 
 <file path=word/document.xml><?xml version="1.0" encoding="utf-8"?>
-<w:document xmlns:wpc="http://schemas.microsoft.com/office/word/2010/wordprocessingCanvas" xmlns:cx="http://schemas.microsoft.com/office/drawing/2014/chartex" xmlns:cx1="http://schemas.microsoft.com/office/drawing/2015/9/8/chartex" xmlns:cx2="http://schemas.microsoft.com/office/drawing/2015/10/21/chartex" xmlns:cx3="http://schemas.microsoft.com/office/drawing/2016/5/9/chartex" xmlns:cx4="http://schemas.microsoft.com/office/drawing/2016/5/10/chartex" xmlns:cx5="http://schemas.microsoft.com/office/drawing/2016/5/11/chartex" xmlns:cx6="http://schemas.microsoft.com/office/drawing/2016/5/12/chartex" xmlns:cx7="http://schemas.microsoft.com/office/drawing/2016/5/13/chartex" xmlns:cx8="http://schemas.microsoft.com/office/drawing/2016/5/14/chartex" xmlns:mc="http://schemas.openxmlformats.org/markup-compatibility/2006" xmlns:aink="http://schemas.microsoft.com/office/drawing/2016/ink" xmlns:am3d="http://schemas.microsoft.com/office/drawing/2017/model3d" xmlns:o="urn:schemas-microsoft-com:office:office" xmlns:r="http://schemas.openxmlformats.org/officeDocument/2006/relationships" xmlns:m="http://schemas.openxmlformats.org/officeDocument/2006/math" xmlns:v="urn:schemas-microsoft-com:vml" xmlns:wp14="http://schemas.microsoft.com/office/word/2010/wordprocessingDrawing" xmlns:wp="http://schemas.openxmlformats.org/drawingml/2006/wordprocessingDrawing" xmlns:w10="urn:schemas-microsoft-com:office:word" xmlns:w="http://schemas.openxmlformats.org/wordprocessingml/2006/main" xmlns:w14="http://schemas.microsoft.com/office/word/2010/wordml" xmlns:w15="http://schemas.microsoft.com/office/word/2012/wordml" xmlns:w16cid="http://schemas.microsoft.com/office/word/2016/wordml/cid" xmlns:w16se="http://schemas.microsoft.com/office/word/2015/wordml/symex" xmlns:wpg="http://schemas.microsoft.com/office/word/2010/wordprocessingGroup" xmlns:wpi="http://schemas.microsoft.com/office/word/2010/wordprocessingInk" xmlns:wne="http://schemas.microsoft.com/office/word/2006/wordml" xmlns:wps="http://schemas.microsoft.com/office/word/2010/wordprocessingShape" mc:Ignorable="w14 w15 w16se w16cid wp14">
+<w:document xmlns:wpc="http://schemas.microsoft.com/office/word/2010/wordprocessingCanvas" xmlns:cx="http://schemas.microsoft.com/office/drawing/2014/chartex" xmlns:cx1="http://schemas.microsoft.com/office/drawing/2015/9/8/chartex" xmlns:cx2="http://schemas.microsoft.com/office/drawing/2015/10/21/chartex" xmlns:cx3="http://schemas.microsoft.com/office/drawing/2016/5/9/chartex" xmlns:cx4="http://schemas.microsoft.com/office/drawing/2016/5/10/chartex" xmlns:cx5="http://schemas.microsoft.com/office/drawing/2016/5/11/chartex" xmlns:cx6="http://schemas.microsoft.com/office/drawing/2016/5/12/chartex" xmlns:cx7="http://schemas.microsoft.com/office/drawing/2016/5/13/chartex" xmlns:cx8="http://schemas.microsoft.com/office/drawing/2016/5/14/chartex" xmlns:mc="http://schemas.openxmlformats.org/markup-compatibility/2006" xmlns:aink="http://schemas.microsoft.com/office/drawing/2016/ink" xmlns:am3d="http://schemas.microsoft.com/office/drawing/2017/model3d" xmlns:o="urn:schemas-microsoft-com:office:office" xmlns:oel="http://schemas.microsoft.com/office/2019/extlst" xmlns:r="http://schemas.openxmlformats.org/officeDocument/2006/relationships" xmlns:m="http://schemas.openxmlformats.org/officeDocument/2006/math" xmlns:v="urn:schemas-microsoft-com:vml" xmlns:wp14="http://schemas.microsoft.com/office/word/2010/wordprocessingDrawing" xmlns:wp="http://schemas.openxmlformats.org/drawingml/2006/wordprocessingDrawing" xmlns:w10="urn:schemas-microsoft-com:office:word" xmlns:w="http://schemas.openxmlformats.org/wordprocessingml/2006/main" xmlns:w14="http://schemas.microsoft.com/office/word/2010/wordml" xmlns:w15="http://schemas.microsoft.com/office/word/2012/wordml" xmlns:w16cex="http://schemas.microsoft.com/office/word/2018/wordml/cex" xmlns:w16cid="http://schemas.microsoft.com/office/word/2016/wordml/cid" xmlns:w16="http://schemas.microsoft.com/office/word/2018/wordml" xmlns:w16du="http://schemas.microsoft.com/office/word/2023/wordml/word16du" xmlns:w16sdtdh="http://schemas.microsoft.com/office/word/2020/wordml/sdtdatahash" xmlns:w16sdtfl="http://schemas.microsoft.com/office/word/2024/wordml/sdtformatlock" xmlns:w16se="http://schemas.microsoft.com/office/word/2015/wordml/symex" xmlns:wpg="http://schemas.microsoft.com/office/word/2010/wordprocessingGroup" xmlns:wpi="http://schemas.microsoft.com/office/word/2010/wordprocessingInk" xmlns:wne="http://schemas.microsoft.com/office/word/2006/wordml" xmlns:wps="http://schemas.microsoft.com/office/word/2010/wordprocessingShape" mc:Ignorable="w14 w15 w16se w16cid w16 w16cex w16sdtdh w16sdtfl w16du wp14">
   <w:body>
     <w:p>
       <w:pPr>
@@ -32,8 +32,6 @@
           <w:lang w:val="sv-SE"/>
         </w:rPr>
       </w:pPr>
-      <w:bookmarkStart w:id="0" w:name="_GoBack"/>
-      <w:bookmarkEnd w:id="0"/>
     </w:p>
     <w:p>
       <w:pPr>
@@ -2158,7 +2156,6 @@
               <w:bottom w:val="single" w:sz="4" w:space="0" w:color="000000"/>
               <w:right w:val="single" w:sz="4" w:space="0" w:color="000000"/>
             </w:tcBorders>
-            <w:shd w:val="clear" w:color="auto" w:fill="auto"/>
             <w:tcMar>
               <w:top w:w="80" w:type="dxa"/>
               <w:left w:w="80" w:type="dxa"/>
@@ -2175,7 +2172,7 @@
                 <w:szCs w:val="20"/>
               </w:rPr>
             </w:pPr>
-            <w:bookmarkStart w:id="1" w:name="_Hlk503365627"/>
+            <w:bookmarkStart w:id="0" w:name="_Hlk503365627"/>
             <w:r>
               <w:rPr>
                 <w:sz w:val="20"/>
@@ -2201,7 +2198,6 @@
               <w:bottom w:val="single" w:sz="4" w:space="0" w:color="000000"/>
               <w:right w:val="single" w:sz="4" w:space="0" w:color="000000"/>
             </w:tcBorders>
-            <w:shd w:val="clear" w:color="auto" w:fill="auto"/>
             <w:tcMar>
               <w:top w:w="80" w:type="dxa"/>
               <w:left w:w="80" w:type="dxa"/>
@@ -2248,7 +2244,6 @@
               <w:bottom w:val="single" w:sz="4" w:space="0" w:color="000000"/>
               <w:right w:val="single" w:sz="4" w:space="0" w:color="000000"/>
             </w:tcBorders>
-            <w:shd w:val="clear" w:color="auto" w:fill="auto"/>
             <w:tcMar>
               <w:top w:w="80" w:type="dxa"/>
               <w:left w:w="80" w:type="dxa"/>
@@ -2304,7 +2299,6 @@
               <w:bottom w:val="single" w:sz="4" w:space="0" w:color="000000"/>
               <w:right w:val="single" w:sz="4" w:space="0" w:color="000000"/>
             </w:tcBorders>
-            <w:shd w:val="clear" w:color="auto" w:fill="auto"/>
             <w:tcMar>
               <w:top w:w="80" w:type="dxa"/>
               <w:left w:w="80" w:type="dxa"/>
@@ -2379,7 +2373,6 @@
               <w:bottom w:val="single" w:sz="4" w:space="0" w:color="000000"/>
               <w:right w:val="single" w:sz="4" w:space="0" w:color="000000"/>
             </w:tcBorders>
-            <w:shd w:val="clear" w:color="auto" w:fill="auto"/>
             <w:tcMar>
               <w:top w:w="80" w:type="dxa"/>
               <w:left w:w="80" w:type="dxa"/>
@@ -2414,7 +2407,6 @@
               <w:bottom w:val="single" w:sz="4" w:space="0" w:color="000000"/>
               <w:right w:val="single" w:sz="4" w:space="0" w:color="000000"/>
             </w:tcBorders>
-            <w:shd w:val="clear" w:color="auto" w:fill="auto"/>
             <w:tcMar>
               <w:top w:w="80" w:type="dxa"/>
               <w:left w:w="80" w:type="dxa"/>
@@ -2468,7 +2460,6 @@
               <w:bottom w:val="single" w:sz="4" w:space="0" w:color="000000"/>
               <w:right w:val="single" w:sz="4" w:space="0" w:color="000000"/>
             </w:tcBorders>
-            <w:shd w:val="clear" w:color="auto" w:fill="auto"/>
             <w:tcMar>
               <w:top w:w="80" w:type="dxa"/>
               <w:left w:w="80" w:type="dxa"/>
@@ -2503,7 +2494,6 @@
               <w:bottom w:val="single" w:sz="4" w:space="0" w:color="000000"/>
               <w:right w:val="single" w:sz="4" w:space="0" w:color="000000"/>
             </w:tcBorders>
-            <w:shd w:val="clear" w:color="auto" w:fill="auto"/>
             <w:tcMar>
               <w:top w:w="80" w:type="dxa"/>
               <w:left w:w="80" w:type="dxa"/>
@@ -2557,7 +2547,6 @@
               <w:bottom w:val="single" w:sz="4" w:space="0" w:color="000000"/>
               <w:right w:val="single" w:sz="4" w:space="0" w:color="000000"/>
             </w:tcBorders>
-            <w:shd w:val="clear" w:color="auto" w:fill="auto"/>
             <w:tcMar>
               <w:top w:w="80" w:type="dxa"/>
               <w:left w:w="80" w:type="dxa"/>
@@ -2592,7 +2581,6 @@
               <w:bottom w:val="single" w:sz="4" w:space="0" w:color="000000"/>
               <w:right w:val="single" w:sz="4" w:space="0" w:color="000000"/>
             </w:tcBorders>
-            <w:shd w:val="clear" w:color="auto" w:fill="auto"/>
             <w:tcMar>
               <w:top w:w="80" w:type="dxa"/>
               <w:left w:w="80" w:type="dxa"/>
@@ -2639,7 +2627,6 @@
               <w:bottom w:val="single" w:sz="4" w:space="0" w:color="000000"/>
               <w:right w:val="single" w:sz="4" w:space="0" w:color="000000"/>
             </w:tcBorders>
-            <w:shd w:val="clear" w:color="auto" w:fill="auto"/>
             <w:tcMar>
               <w:top w:w="80" w:type="dxa"/>
               <w:left w:w="80" w:type="dxa"/>
@@ -2674,7 +2661,6 @@
               <w:bottom w:val="single" w:sz="4" w:space="0" w:color="000000"/>
               <w:right w:val="single" w:sz="4" w:space="0" w:color="000000"/>
             </w:tcBorders>
-            <w:shd w:val="clear" w:color="auto" w:fill="auto"/>
             <w:tcMar>
               <w:top w:w="80" w:type="dxa"/>
               <w:left w:w="80" w:type="dxa"/>
@@ -2714,7 +2700,6 @@
               <w:bottom w:val="single" w:sz="4" w:space="0" w:color="000000"/>
               <w:right w:val="single" w:sz="4" w:space="0" w:color="000000"/>
             </w:tcBorders>
-            <w:shd w:val="clear" w:color="auto" w:fill="auto"/>
             <w:tcMar>
               <w:top w:w="80" w:type="dxa"/>
               <w:left w:w="80" w:type="dxa"/>
@@ -2749,7 +2734,6 @@
               <w:bottom w:val="single" w:sz="4" w:space="0" w:color="000000"/>
               <w:right w:val="single" w:sz="4" w:space="0" w:color="000000"/>
             </w:tcBorders>
-            <w:shd w:val="clear" w:color="auto" w:fill="auto"/>
             <w:tcMar>
               <w:top w:w="80" w:type="dxa"/>
               <w:left w:w="80" w:type="dxa"/>
@@ -2789,7 +2773,6 @@
               <w:bottom w:val="single" w:sz="4" w:space="0" w:color="000000"/>
               <w:right w:val="single" w:sz="4" w:space="0" w:color="000000"/>
             </w:tcBorders>
-            <w:shd w:val="clear" w:color="auto" w:fill="auto"/>
             <w:tcMar>
               <w:top w:w="80" w:type="dxa"/>
               <w:left w:w="80" w:type="dxa"/>
@@ -2824,7 +2807,6 @@
               <w:bottom w:val="single" w:sz="4" w:space="0" w:color="000000"/>
               <w:right w:val="single" w:sz="4" w:space="0" w:color="000000"/>
             </w:tcBorders>
-            <w:shd w:val="clear" w:color="auto" w:fill="auto"/>
             <w:tcMar>
               <w:top w:w="80" w:type="dxa"/>
               <w:left w:w="80" w:type="dxa"/>
@@ -2913,7 +2895,6 @@
               <w:bottom w:val="single" w:sz="4" w:space="0" w:color="000000"/>
               <w:right w:val="single" w:sz="4" w:space="0" w:color="000000"/>
             </w:tcBorders>
-            <w:shd w:val="clear" w:color="auto" w:fill="auto"/>
             <w:tcMar>
               <w:top w:w="80" w:type="dxa"/>
               <w:left w:w="80" w:type="dxa"/>
@@ -2962,7 +2943,6 @@
               <w:bottom w:val="single" w:sz="4" w:space="0" w:color="000000"/>
               <w:right w:val="single" w:sz="4" w:space="0" w:color="000000"/>
             </w:tcBorders>
-            <w:shd w:val="clear" w:color="auto" w:fill="auto"/>
             <w:tcMar>
               <w:top w:w="80" w:type="dxa"/>
               <w:left w:w="80" w:type="dxa"/>
@@ -3003,7 +2983,7 @@
           </w:p>
         </w:tc>
       </w:tr>
-      <w:bookmarkEnd w:id="1"/>
+      <w:bookmarkEnd w:id="0"/>
     </w:tbl>
     <w:p>
       <w:pPr>
@@ -3038,7 +3018,7 @@
           <w:u w:val="single"/>
         </w:rPr>
       </w:pPr>
-      <w:bookmarkStart w:id="2" w:name="_Hlk503355877"/>
+      <w:bookmarkStart w:id="1" w:name="_Hlk503355877"/>
       <w:r>
         <w:rPr>
           <w:b/>
@@ -3138,23 +3118,42 @@
         <w:t xml:space="preserve"> – UIS </w:t>
       </w:r>
     </w:p>
-    <w:bookmarkEnd w:id="2"/>
-    <w:p>
-      <w:pPr>
-        <w:pStyle w:val="NoSpacing"/>
-        <w:jc w:val="both"/>
-        <w:rPr>
-          <w:sz w:val="20"/>
-          <w:szCs w:val="20"/>
-        </w:rPr>
-      </w:pPr>
-      <w:r>
-        <w:rPr>
-          <w:sz w:val="20"/>
-          <w:szCs w:val="20"/>
-        </w:rPr>
-        <w:t>Business Intelligence</w:t>
-      </w:r>
+    <w:bookmarkEnd w:id="1"/>
+    <w:p>
+      <w:pPr>
+        <w:pStyle w:val="NoSpacing"/>
+        <w:jc w:val="both"/>
+        <w:rPr>
+          <w:sz w:val="20"/>
+          <w:szCs w:val="20"/>
+          <w:lang w:val="en-IN"/>
+        </w:rPr>
+      </w:pPr>
+      <w:r>
+        <w:rPr>
+          <w:sz w:val="20"/>
+          <w:szCs w:val="20"/>
+        </w:rPr>
+        <w:t xml:space="preserve">Business </w:t>
+      </w:r>
+      <w:r>
+        <w:rPr>
+          <w:sz w:val="20"/>
+          <w:szCs w:val="20"/>
+          <w:lang w:val="en-IN"/>
+        </w:rPr>
+        <w:t>legal</w:t>
+      </w:r>
+    </w:p>
+    <w:p>
+      <w:pPr>
+        <w:pStyle w:val="NoSpacing"/>
+        <w:jc w:val="both"/>
+        <w:rPr>
+          <w:sz w:val="20"/>
+          <w:szCs w:val="20"/>
+        </w:rPr>
+      </w:pPr>
       <w:r>
         <w:rPr>
           <w:sz w:val="20"/>
@@ -3195,7 +3194,7 @@
           <w:u w:val="single"/>
         </w:rPr>
       </w:pPr>
-      <w:bookmarkStart w:id="3" w:name="_Hlk503356022"/>
+      <w:bookmarkStart w:id="2" w:name="_Hlk503356022"/>
       <w:r>
         <w:rPr>
           <w:b/>
@@ -3205,7 +3204,7 @@
         </w:rPr>
         <w:t>Experience:</w:t>
       </w:r>
-      <w:bookmarkEnd w:id="3"/>
+      <w:bookmarkEnd w:id="2"/>
     </w:p>
     <w:p>
       <w:pPr>
@@ -3465,6 +3464,7 @@
           <w:sz w:val="20"/>
           <w:szCs w:val="20"/>
         </w:rPr>
+        <w:lastRenderedPageBreak/>
         <w:t xml:space="preserve">Responsible for writing the release notes and updating the </w:t>
       </w:r>
       <w:r>
@@ -3522,7 +3522,6 @@
           <w:sz w:val="20"/>
           <w:szCs w:val="20"/>
         </w:rPr>
-        <w:lastRenderedPageBreak/>
         <w:t>Interacted with Technical Support team and helping them resolve their support issues on Enhancement requests from customers.</w:t>
       </w:r>
     </w:p>
@@ -6143,29 +6142,7 @@
           <w:szCs w:val="20"/>
           <w:u w:color="000000"/>
         </w:rPr>
-        <w:t xml:space="preserve">Hands on experience on </w:t>
-      </w:r>
-      <w:proofErr w:type="spellStart"/>
-      <w:r>
-        <w:rPr>
-          <w:rFonts w:eastAsia="Calibri"/>
-          <w:color w:val="000000"/>
-          <w:sz w:val="20"/>
-          <w:szCs w:val="20"/>
-          <w:u w:color="000000"/>
-        </w:rPr>
-        <w:t>Balsamiq</w:t>
-      </w:r>
-      <w:proofErr w:type="spellEnd"/>
-      <w:r>
-        <w:rPr>
-          <w:rFonts w:eastAsia="Calibri"/>
-          <w:color w:val="000000"/>
-          <w:sz w:val="20"/>
-          <w:szCs w:val="20"/>
-          <w:u w:color="000000"/>
-        </w:rPr>
-        <w:t xml:space="preserve"> mockup tool.</w:t>
+        <w:t>Hands on experience on Balsamiq mockup tool.</w:t>
       </w:r>
     </w:p>
     <w:p>
@@ -7194,29 +7171,7 @@
           <w:szCs w:val="20"/>
           <w:u w:color="000000"/>
         </w:rPr>
-        <w:t xml:space="preserve">Hands on experience on </w:t>
-      </w:r>
-      <w:proofErr w:type="spellStart"/>
-      <w:r>
-        <w:rPr>
-          <w:rFonts w:eastAsia="Calibri"/>
-          <w:color w:val="000000"/>
-          <w:sz w:val="20"/>
-          <w:szCs w:val="20"/>
-          <w:u w:color="000000"/>
-        </w:rPr>
-        <w:t>Balsamiq</w:t>
-      </w:r>
-      <w:proofErr w:type="spellEnd"/>
-      <w:r>
-        <w:rPr>
-          <w:rFonts w:eastAsia="Calibri"/>
-          <w:color w:val="000000"/>
-          <w:sz w:val="20"/>
-          <w:szCs w:val="20"/>
-          <w:u w:color="000000"/>
-        </w:rPr>
-        <w:t xml:space="preserve"> mockup tool.</w:t>
+        <w:t>Hands on experience on Balsamiq mockup tool.</w:t>
       </w:r>
     </w:p>
     <w:p>
@@ -8821,29 +8776,7 @@
           <w:szCs w:val="20"/>
           <w:u w:color="000000"/>
         </w:rPr>
-        <w:t xml:space="preserve">Hands on experience on </w:t>
-      </w:r>
-      <w:proofErr w:type="spellStart"/>
-      <w:r>
-        <w:rPr>
-          <w:rFonts w:eastAsia="Calibri"/>
-          <w:color w:val="000000"/>
-          <w:sz w:val="20"/>
-          <w:szCs w:val="20"/>
-          <w:u w:color="000000"/>
-        </w:rPr>
-        <w:t>Balsamiq</w:t>
-      </w:r>
-      <w:proofErr w:type="spellEnd"/>
-      <w:r>
-        <w:rPr>
-          <w:rFonts w:eastAsia="Calibri"/>
-          <w:color w:val="000000"/>
-          <w:sz w:val="20"/>
-          <w:szCs w:val="20"/>
-          <w:u w:color="000000"/>
-        </w:rPr>
-        <w:t xml:space="preserve"> mockup tool.</w:t>
+        <w:t>Hands on experience on Balsamiq mockup tool.</w:t>
       </w:r>
     </w:p>
     <w:p>
@@ -9351,7 +9284,7 @@
 </file>
 
 <file path=word/endnotes.xml><?xml version="1.0" encoding="utf-8"?>
-<w:endnotes xmlns:wpc="http://schemas.microsoft.com/office/word/2010/wordprocessingCanvas" xmlns:cx="http://schemas.microsoft.com/office/drawing/2014/chartex" xmlns:cx1="http://schemas.microsoft.com/office/drawing/2015/9/8/chartex" xmlns:cx2="http://schemas.microsoft.com/office/drawing/2015/10/21/chartex" xmlns:cx3="http://schemas.microsoft.com/office/drawing/2016/5/9/chartex" xmlns:cx4="http://schemas.microsoft.com/office/drawing/2016/5/10/chartex" xmlns:cx5="http://schemas.microsoft.com/office/drawing/2016/5/11/chartex" xmlns:cx6="http://schemas.microsoft.com/office/drawing/2016/5/12/chartex" xmlns:cx7="http://schemas.microsoft.com/office/drawing/2016/5/13/chartex" xmlns:cx8="http://schemas.microsoft.com/office/drawing/2016/5/14/chartex" xmlns:mc="http://schemas.openxmlformats.org/markup-compatibility/2006" xmlns:aink="http://schemas.microsoft.com/office/drawing/2016/ink" xmlns:am3d="http://schemas.microsoft.com/office/drawing/2017/model3d" xmlns:o="urn:schemas-microsoft-com:office:office" xmlns:r="http://schemas.openxmlformats.org/officeDocument/2006/relationships" xmlns:m="http://schemas.openxmlformats.org/officeDocument/2006/math" xmlns:v="urn:schemas-microsoft-com:vml" xmlns:wp14="http://schemas.microsoft.com/office/word/2010/wordprocessingDrawing" xmlns:wp="http://schemas.openxmlformats.org/drawingml/2006/wordprocessingDrawing" xmlns:w10="urn:schemas-microsoft-com:office:word" xmlns:w="http://schemas.openxmlformats.org/wordprocessingml/2006/main" xmlns:w14="http://schemas.microsoft.com/office/word/2010/wordml" xmlns:w15="http://schemas.microsoft.com/office/word/2012/wordml" xmlns:w16cid="http://schemas.microsoft.com/office/word/2016/wordml/cid" xmlns:w16se="http://schemas.microsoft.com/office/word/2015/wordml/symex" xmlns:wpg="http://schemas.microsoft.com/office/word/2010/wordprocessingGroup" xmlns:wpi="http://schemas.microsoft.com/office/word/2010/wordprocessingInk" xmlns:wne="http://schemas.microsoft.com/office/word/2006/wordml" xmlns:wps="http://schemas.microsoft.com/office/word/2010/wordprocessingShape" mc:Ignorable="w14 w15 w16se w16cid wp14">
+<w:endnotes xmlns:wpc="http://schemas.microsoft.com/office/word/2010/wordprocessingCanvas" xmlns:cx="http://schemas.microsoft.com/office/drawing/2014/chartex" xmlns:cx1="http://schemas.microsoft.com/office/drawing/2015/9/8/chartex" xmlns:cx2="http://schemas.microsoft.com/office/drawing/2015/10/21/chartex" xmlns:cx3="http://schemas.microsoft.com/office/drawing/2016/5/9/chartex" xmlns:cx4="http://schemas.microsoft.com/office/drawing/2016/5/10/chartex" xmlns:cx5="http://schemas.microsoft.com/office/drawing/2016/5/11/chartex" xmlns:cx6="http://schemas.microsoft.com/office/drawing/2016/5/12/chartex" xmlns:cx7="http://schemas.microsoft.com/office/drawing/2016/5/13/chartex" xmlns:cx8="http://schemas.microsoft.com/office/drawing/2016/5/14/chartex" xmlns:mc="http://schemas.openxmlformats.org/markup-compatibility/2006" xmlns:aink="http://schemas.microsoft.com/office/drawing/2016/ink" xmlns:am3d="http://schemas.microsoft.com/office/drawing/2017/model3d" xmlns:o="urn:schemas-microsoft-com:office:office" xmlns:oel="http://schemas.microsoft.com/office/2019/extlst" xmlns:r="http://schemas.openxmlformats.org/officeDocument/2006/relationships" xmlns:m="http://schemas.openxmlformats.org/officeDocument/2006/math" xmlns:v="urn:schemas-microsoft-com:vml" xmlns:wp14="http://schemas.microsoft.com/office/word/2010/wordprocessingDrawing" xmlns:wp="http://schemas.openxmlformats.org/drawingml/2006/wordprocessingDrawing" xmlns:w10="urn:schemas-microsoft-com:office:word" xmlns:w="http://schemas.openxmlformats.org/wordprocessingml/2006/main" xmlns:w14="http://schemas.microsoft.com/office/word/2010/wordml" xmlns:w15="http://schemas.microsoft.com/office/word/2012/wordml" xmlns:w16cex="http://schemas.microsoft.com/office/word/2018/wordml/cex" xmlns:w16cid="http://schemas.microsoft.com/office/word/2016/wordml/cid" xmlns:w16="http://schemas.microsoft.com/office/word/2018/wordml" xmlns:w16du="http://schemas.microsoft.com/office/word/2023/wordml/word16du" xmlns:w16sdtdh="http://schemas.microsoft.com/office/word/2020/wordml/sdtdatahash" xmlns:w16sdtfl="http://schemas.microsoft.com/office/word/2024/wordml/sdtformatlock" xmlns:w16se="http://schemas.microsoft.com/office/word/2015/wordml/symex" xmlns:wpg="http://schemas.microsoft.com/office/word/2010/wordprocessingGroup" xmlns:wpi="http://schemas.microsoft.com/office/word/2010/wordprocessingInk" xmlns:wne="http://schemas.microsoft.com/office/word/2006/wordml" xmlns:wps="http://schemas.microsoft.com/office/word/2010/wordprocessingShape" mc:Ignorable="w14 w15 w16se w16cid w16 w16cex w16sdtdh w16sdtfl w16du wp14">
   <w:endnote w:type="separator" w:id="-1">
     <w:p>
       <w:r>
@@ -9370,7 +9303,7 @@
 </file>
 
 <file path=word/footer1.xml><?xml version="1.0" encoding="utf-8"?>
-<w:ftr xmlns:wpc="http://schemas.microsoft.com/office/word/2010/wordprocessingCanvas" xmlns:cx="http://schemas.microsoft.com/office/drawing/2014/chartex" xmlns:cx1="http://schemas.microsoft.com/office/drawing/2015/9/8/chartex" xmlns:cx2="http://schemas.microsoft.com/office/drawing/2015/10/21/chartex" xmlns:cx3="http://schemas.microsoft.com/office/drawing/2016/5/9/chartex" xmlns:cx4="http://schemas.microsoft.com/office/drawing/2016/5/10/chartex" xmlns:cx5="http://schemas.microsoft.com/office/drawing/2016/5/11/chartex" xmlns:cx6="http://schemas.microsoft.com/office/drawing/2016/5/12/chartex" xmlns:cx7="http://schemas.microsoft.com/office/drawing/2016/5/13/chartex" xmlns:cx8="http://schemas.microsoft.com/office/drawing/2016/5/14/chartex" xmlns:mc="http://schemas.openxmlformats.org/markup-compatibility/2006" xmlns:aink="http://schemas.microsoft.com/office/drawing/2016/ink" xmlns:am3d="http://schemas.microsoft.com/office/drawing/2017/model3d" xmlns:o="urn:schemas-microsoft-com:office:office" xmlns:r="http://schemas.openxmlformats.org/officeDocument/2006/relationships" xmlns:m="http://schemas.openxmlformats.org/officeDocument/2006/math" xmlns:v="urn:schemas-microsoft-com:vml" xmlns:wp14="http://schemas.microsoft.com/office/word/2010/wordprocessingDrawing" xmlns:wp="http://schemas.openxmlformats.org/drawingml/2006/wordprocessingDrawing" xmlns:w10="urn:schemas-microsoft-com:office:word" xmlns:w="http://schemas.openxmlformats.org/wordprocessingml/2006/main" xmlns:w14="http://schemas.microsoft.com/office/word/2010/wordml" xmlns:w15="http://schemas.microsoft.com/office/word/2012/wordml" xmlns:w16cid="http://schemas.microsoft.com/office/word/2016/wordml/cid" xmlns:w16se="http://schemas.microsoft.com/office/word/2015/wordml/symex" xmlns:wpg="http://schemas.microsoft.com/office/word/2010/wordprocessingGroup" xmlns:wpi="http://schemas.microsoft.com/office/word/2010/wordprocessingInk" xmlns:wne="http://schemas.microsoft.com/office/word/2006/wordml" xmlns:wps="http://schemas.microsoft.com/office/word/2010/wordprocessingShape" mc:Ignorable="w14 w15 w16se w16cid wp14">
+<w:ftr xmlns:wpc="http://schemas.microsoft.com/office/word/2010/wordprocessingCanvas" xmlns:cx="http://schemas.microsoft.com/office/drawing/2014/chartex" xmlns:cx1="http://schemas.microsoft.com/office/drawing/2015/9/8/chartex" xmlns:cx2="http://schemas.microsoft.com/office/drawing/2015/10/21/chartex" xmlns:cx3="http://schemas.microsoft.com/office/drawing/2016/5/9/chartex" xmlns:cx4="http://schemas.microsoft.com/office/drawing/2016/5/10/chartex" xmlns:cx5="http://schemas.microsoft.com/office/drawing/2016/5/11/chartex" xmlns:cx6="http://schemas.microsoft.com/office/drawing/2016/5/12/chartex" xmlns:cx7="http://schemas.microsoft.com/office/drawing/2016/5/13/chartex" xmlns:cx8="http://schemas.microsoft.com/office/drawing/2016/5/14/chartex" xmlns:mc="http://schemas.openxmlformats.org/markup-compatibility/2006" xmlns:aink="http://schemas.microsoft.com/office/drawing/2016/ink" xmlns:am3d="http://schemas.microsoft.com/office/drawing/2017/model3d" xmlns:o="urn:schemas-microsoft-com:office:office" xmlns:oel="http://schemas.microsoft.com/office/2019/extlst" xmlns:r="http://schemas.openxmlformats.org/officeDocument/2006/relationships" xmlns:m="http://schemas.openxmlformats.org/officeDocument/2006/math" xmlns:v="urn:schemas-microsoft-com:vml" xmlns:wp14="http://schemas.microsoft.com/office/word/2010/wordprocessingDrawing" xmlns:wp="http://schemas.openxmlformats.org/drawingml/2006/wordprocessingDrawing" xmlns:w10="urn:schemas-microsoft-com:office:word" xmlns:w="http://schemas.openxmlformats.org/wordprocessingml/2006/main" xmlns:w14="http://schemas.microsoft.com/office/word/2010/wordml" xmlns:w15="http://schemas.microsoft.com/office/word/2012/wordml" xmlns:w16cex="http://schemas.microsoft.com/office/word/2018/wordml/cex" xmlns:w16cid="http://schemas.microsoft.com/office/word/2016/wordml/cid" xmlns:w16="http://schemas.microsoft.com/office/word/2018/wordml" xmlns:w16du="http://schemas.microsoft.com/office/word/2023/wordml/word16du" xmlns:w16sdtdh="http://schemas.microsoft.com/office/word/2020/wordml/sdtdatahash" xmlns:w16sdtfl="http://schemas.microsoft.com/office/word/2024/wordml/sdtformatlock" xmlns:w16se="http://schemas.microsoft.com/office/word/2015/wordml/symex" xmlns:wpg="http://schemas.microsoft.com/office/word/2010/wordprocessingGroup" xmlns:wpi="http://schemas.microsoft.com/office/word/2010/wordprocessingInk" xmlns:wne="http://schemas.microsoft.com/office/word/2006/wordml" xmlns:wps="http://schemas.microsoft.com/office/word/2010/wordprocessingShape" mc:Ignorable="w14 w15 w16se w16cid w16 w16cex w16sdtdh w16sdtfl w16du wp14">
   <w:p>
     <w:pPr>
       <w:pStyle w:val="Footer"/>
@@ -9399,7 +9332,7 @@
 </file>
 
 <file path=word/footnotes.xml><?xml version="1.0" encoding="utf-8"?>
-<w:footnotes xmlns:wpc="http://schemas.microsoft.com/office/word/2010/wordprocessingCanvas" xmlns:cx="http://schemas.microsoft.com/office/drawing/2014/chartex" xmlns:cx1="http://schemas.microsoft.com/office/drawing/2015/9/8/chartex" xmlns:cx2="http://schemas.microsoft.com/office/drawing/2015/10/21/chartex" xmlns:cx3="http://schemas.microsoft.com/office/drawing/2016/5/9/chartex" xmlns:cx4="http://schemas.microsoft.com/office/drawing/2016/5/10/chartex" xmlns:cx5="http://schemas.microsoft.com/office/drawing/2016/5/11/chartex" xmlns:cx6="http://schemas.microsoft.com/office/drawing/2016/5/12/chartex" xmlns:cx7="http://schemas.microsoft.com/office/drawing/2016/5/13/chartex" xmlns:cx8="http://schemas.microsoft.com/office/drawing/2016/5/14/chartex" xmlns:mc="http://schemas.openxmlformats.org/markup-compatibility/2006" xmlns:aink="http://schemas.microsoft.com/office/drawing/2016/ink" xmlns:am3d="http://schemas.microsoft.com/office/drawing/2017/model3d" xmlns:o="urn:schemas-microsoft-com:office:office" xmlns:r="http://schemas.openxmlformats.org/officeDocument/2006/relationships" xmlns:m="http://schemas.openxmlformats.org/officeDocument/2006/math" xmlns:v="urn:schemas-microsoft-com:vml" xmlns:wp14="http://schemas.microsoft.com/office/word/2010/wordprocessingDrawing" xmlns:wp="http://schemas.openxmlformats.org/drawingml/2006/wordprocessingDrawing" xmlns:w10="urn:schemas-microsoft-com:office:word" xmlns:w="http://schemas.openxmlformats.org/wordprocessingml/2006/main" xmlns:w14="http://schemas.microsoft.com/office/word/2010/wordml" xmlns:w15="http://schemas.microsoft.com/office/word/2012/wordml" xmlns:w16cid="http://schemas.microsoft.com/office/word/2016/wordml/cid" xmlns:w16se="http://schemas.microsoft.com/office/word/2015/wordml/symex" xmlns:wpg="http://schemas.microsoft.com/office/word/2010/wordprocessingGroup" xmlns:wpi="http://schemas.microsoft.com/office/word/2010/wordprocessingInk" xmlns:wne="http://schemas.microsoft.com/office/word/2006/wordml" xmlns:wps="http://schemas.microsoft.com/office/word/2010/wordprocessingShape" mc:Ignorable="w14 w15 w16se w16cid wp14">
+<w:footnotes xmlns:wpc="http://schemas.microsoft.com/office/word/2010/wordprocessingCanvas" xmlns:cx="http://schemas.microsoft.com/office/drawing/2014/chartex" xmlns:cx1="http://schemas.microsoft.com/office/drawing/2015/9/8/chartex" xmlns:cx2="http://schemas.microsoft.com/office/drawing/2015/10/21/chartex" xmlns:cx3="http://schemas.microsoft.com/office/drawing/2016/5/9/chartex" xmlns:cx4="http://schemas.microsoft.com/office/drawing/2016/5/10/chartex" xmlns:cx5="http://schemas.microsoft.com/office/drawing/2016/5/11/chartex" xmlns:cx6="http://schemas.microsoft.com/office/drawing/2016/5/12/chartex" xmlns:cx7="http://schemas.microsoft.com/office/drawing/2016/5/13/chartex" xmlns:cx8="http://schemas.microsoft.com/office/drawing/2016/5/14/chartex" xmlns:mc="http://schemas.openxmlformats.org/markup-compatibility/2006" xmlns:aink="http://schemas.microsoft.com/office/drawing/2016/ink" xmlns:am3d="http://schemas.microsoft.com/office/drawing/2017/model3d" xmlns:o="urn:schemas-microsoft-com:office:office" xmlns:oel="http://schemas.microsoft.com/office/2019/extlst" xmlns:r="http://schemas.openxmlformats.org/officeDocument/2006/relationships" xmlns:m="http://schemas.openxmlformats.org/officeDocument/2006/math" xmlns:v="urn:schemas-microsoft-com:vml" xmlns:wp14="http://schemas.microsoft.com/office/word/2010/wordprocessingDrawing" xmlns:wp="http://schemas.openxmlformats.org/drawingml/2006/wordprocessingDrawing" xmlns:w10="urn:schemas-microsoft-com:office:word" xmlns:w="http://schemas.openxmlformats.org/wordprocessingml/2006/main" xmlns:w14="http://schemas.microsoft.com/office/word/2010/wordml" xmlns:w15="http://schemas.microsoft.com/office/word/2012/wordml" xmlns:w16cex="http://schemas.microsoft.com/office/word/2018/wordml/cex" xmlns:w16cid="http://schemas.microsoft.com/office/word/2016/wordml/cid" xmlns:w16="http://schemas.microsoft.com/office/word/2018/wordml" xmlns:w16du="http://schemas.microsoft.com/office/word/2023/wordml/word16du" xmlns:w16sdtdh="http://schemas.microsoft.com/office/word/2020/wordml/sdtdatahash" xmlns:w16sdtfl="http://schemas.microsoft.com/office/word/2024/wordml/sdtformatlock" xmlns:w16se="http://schemas.microsoft.com/office/word/2015/wordml/symex" xmlns:wpg="http://schemas.microsoft.com/office/word/2010/wordprocessingGroup" xmlns:wpi="http://schemas.microsoft.com/office/word/2010/wordprocessingInk" xmlns:wne="http://schemas.microsoft.com/office/word/2006/wordml" xmlns:wps="http://schemas.microsoft.com/office/word/2010/wordprocessingShape" mc:Ignorable="w14 w15 w16se w16cid w16 w16cex w16sdtdh w16sdtfl w16du wp14">
   <w:footnote w:type="separator" w:id="-1">
     <w:p>
       <w:r>
@@ -9418,7 +9351,7 @@
 </file>
 
 <file path=word/header1.xml><?xml version="1.0" encoding="utf-8"?>
-<w:hdr xmlns:wpc="http://schemas.microsoft.com/office/word/2010/wordprocessingCanvas" xmlns:cx="http://schemas.microsoft.com/office/drawing/2014/chartex" xmlns:cx1="http://schemas.microsoft.com/office/drawing/2015/9/8/chartex" xmlns:cx2="http://schemas.microsoft.com/office/drawing/2015/10/21/chartex" xmlns:cx3="http://schemas.microsoft.com/office/drawing/2016/5/9/chartex" xmlns:cx4="http://schemas.microsoft.com/office/drawing/2016/5/10/chartex" xmlns:cx5="http://schemas.microsoft.com/office/drawing/2016/5/11/chartex" xmlns:cx6="http://schemas.microsoft.com/office/drawing/2016/5/12/chartex" xmlns:cx7="http://schemas.microsoft.com/office/drawing/2016/5/13/chartex" xmlns:cx8="http://schemas.microsoft.com/office/drawing/2016/5/14/chartex" xmlns:mc="http://schemas.openxmlformats.org/markup-compatibility/2006" xmlns:aink="http://schemas.microsoft.com/office/drawing/2016/ink" xmlns:am3d="http://schemas.microsoft.com/office/drawing/2017/model3d" xmlns:o="urn:schemas-microsoft-com:office:office" xmlns:r="http://schemas.openxmlformats.org/officeDocument/2006/relationships" xmlns:m="http://schemas.openxmlformats.org/officeDocument/2006/math" xmlns:v="urn:schemas-microsoft-com:vml" xmlns:wp14="http://schemas.microsoft.com/office/word/2010/wordprocessingDrawing" xmlns:wp="http://schemas.openxmlformats.org/drawingml/2006/wordprocessingDrawing" xmlns:w10="urn:schemas-microsoft-com:office:word" xmlns:w="http://schemas.openxmlformats.org/wordprocessingml/2006/main" xmlns:w14="http://schemas.microsoft.com/office/word/2010/wordml" xmlns:w15="http://schemas.microsoft.com/office/word/2012/wordml" xmlns:w16cid="http://schemas.microsoft.com/office/word/2016/wordml/cid" xmlns:w16se="http://schemas.microsoft.com/office/word/2015/wordml/symex" xmlns:wpg="http://schemas.microsoft.com/office/word/2010/wordprocessingGroup" xmlns:wpi="http://schemas.microsoft.com/office/word/2010/wordprocessingInk" xmlns:wne="http://schemas.microsoft.com/office/word/2006/wordml" xmlns:wps="http://schemas.microsoft.com/office/word/2010/wordprocessingShape" mc:Ignorable="w14 w15 w16se w16cid wp14">
+<w:hdr xmlns:wpc="http://schemas.microsoft.com/office/word/2010/wordprocessingCanvas" xmlns:cx="http://schemas.microsoft.com/office/drawing/2014/chartex" xmlns:cx1="http://schemas.microsoft.com/office/drawing/2015/9/8/chartex" xmlns:cx2="http://schemas.microsoft.com/office/drawing/2015/10/21/chartex" xmlns:cx3="http://schemas.microsoft.com/office/drawing/2016/5/9/chartex" xmlns:cx4="http://schemas.microsoft.com/office/drawing/2016/5/10/chartex" xmlns:cx5="http://schemas.microsoft.com/office/drawing/2016/5/11/chartex" xmlns:cx6="http://schemas.microsoft.com/office/drawing/2016/5/12/chartex" xmlns:cx7="http://schemas.microsoft.com/office/drawing/2016/5/13/chartex" xmlns:cx8="http://schemas.microsoft.com/office/drawing/2016/5/14/chartex" xmlns:mc="http://schemas.openxmlformats.org/markup-compatibility/2006" xmlns:aink="http://schemas.microsoft.com/office/drawing/2016/ink" xmlns:am3d="http://schemas.microsoft.com/office/drawing/2017/model3d" xmlns:o="urn:schemas-microsoft-com:office:office" xmlns:oel="http://schemas.microsoft.com/office/2019/extlst" xmlns:r="http://schemas.openxmlformats.org/officeDocument/2006/relationships" xmlns:m="http://schemas.openxmlformats.org/officeDocument/2006/math" xmlns:v="urn:schemas-microsoft-com:vml" xmlns:wp14="http://schemas.microsoft.com/office/word/2010/wordprocessingDrawing" xmlns:wp="http://schemas.openxmlformats.org/drawingml/2006/wordprocessingDrawing" xmlns:w10="urn:schemas-microsoft-com:office:word" xmlns:w="http://schemas.openxmlformats.org/wordprocessingml/2006/main" xmlns:w14="http://schemas.microsoft.com/office/word/2010/wordml" xmlns:w15="http://schemas.microsoft.com/office/word/2012/wordml" xmlns:w16cex="http://schemas.microsoft.com/office/word/2018/wordml/cex" xmlns:w16cid="http://schemas.microsoft.com/office/word/2016/wordml/cid" xmlns:w16="http://schemas.microsoft.com/office/word/2018/wordml" xmlns:w16du="http://schemas.microsoft.com/office/word/2023/wordml/word16du" xmlns:w16sdtdh="http://schemas.microsoft.com/office/word/2020/wordml/sdtdatahash" xmlns:w16sdtfl="http://schemas.microsoft.com/office/word/2024/wordml/sdtformatlock" xmlns:w16se="http://schemas.microsoft.com/office/word/2015/wordml/symex" xmlns:wpg="http://schemas.microsoft.com/office/word/2010/wordprocessingGroup" xmlns:wpi="http://schemas.microsoft.com/office/word/2010/wordprocessingInk" xmlns:wne="http://schemas.microsoft.com/office/word/2006/wordml" xmlns:wps="http://schemas.microsoft.com/office/word/2010/wordprocessingShape" mc:Ignorable="w14 w15 w16se w16cid w16 w16cex w16sdtdh w16sdtfl w16du wp14">
   <w:p>
     <w:pPr>
       <w:pStyle w:val="BodyA"/>
@@ -9437,7 +9370,7 @@
         <w:szCs w:val="28"/>
       </w:rPr>
       <w:drawing>
-        <wp:inline distT="0" distB="0" distL="0" distR="0">
+        <wp:inline distT="0" distB="0" distL="0" distR="0" wp14:anchorId="3871C5A7" wp14:editId="7FB864D7">
           <wp:extent cx="1261110" cy="640080"/>
           <wp:effectExtent l="19050" t="0" r="0" b="0"/>
           <wp:docPr id="6" name="Picture 1" descr="scrum_master_certification.png"/>
@@ -9585,7 +9518,7 @@
 </file>
 
 <file path=word/numbering.xml><?xml version="1.0" encoding="utf-8"?>
-<w:numbering xmlns:wpc="http://schemas.microsoft.com/office/word/2010/wordprocessingCanvas" xmlns:cx="http://schemas.microsoft.com/office/drawing/2014/chartex" xmlns:cx1="http://schemas.microsoft.com/office/drawing/2015/9/8/chartex" xmlns:cx2="http://schemas.microsoft.com/office/drawing/2015/10/21/chartex" xmlns:cx3="http://schemas.microsoft.com/office/drawing/2016/5/9/chartex" xmlns:cx4="http://schemas.microsoft.com/office/drawing/2016/5/10/chartex" xmlns:cx5="http://schemas.microsoft.com/office/drawing/2016/5/11/chartex" xmlns:cx6="http://schemas.microsoft.com/office/drawing/2016/5/12/chartex" xmlns:cx7="http://schemas.microsoft.com/office/drawing/2016/5/13/chartex" xmlns:cx8="http://schemas.microsoft.com/office/drawing/2016/5/14/chartex" xmlns:mc="http://schemas.openxmlformats.org/markup-compatibility/2006" xmlns:aink="http://schemas.microsoft.com/office/drawing/2016/ink" xmlns:am3d="http://schemas.microsoft.com/office/drawing/2017/model3d" xmlns:o="urn:schemas-microsoft-com:office:office" xmlns:r="http://schemas.openxmlformats.org/officeDocument/2006/relationships" xmlns:m="http://schemas.openxmlformats.org/officeDocument/2006/math" xmlns:v="urn:schemas-microsoft-com:vml" xmlns:wp14="http://schemas.microsoft.com/office/word/2010/wordprocessingDrawing" xmlns:wp="http://schemas.openxmlformats.org/drawingml/2006/wordprocessingDrawing" xmlns:w10="urn:schemas-microsoft-com:office:word" xmlns:w="http://schemas.openxmlformats.org/wordprocessingml/2006/main" xmlns:w14="http://schemas.microsoft.com/office/word/2010/wordml" xmlns:w15="http://schemas.microsoft.com/office/word/2012/wordml" xmlns:w16cid="http://schemas.microsoft.com/office/word/2016/wordml/cid" xmlns:w16se="http://schemas.microsoft.com/office/word/2015/wordml/symex" xmlns:wpg="http://schemas.microsoft.com/office/word/2010/wordprocessingGroup" xmlns:wpi="http://schemas.microsoft.com/office/word/2010/wordprocessingInk" xmlns:wne="http://schemas.microsoft.com/office/word/2006/wordml" xmlns:wps="http://schemas.microsoft.com/office/word/2010/wordprocessingShape" mc:Ignorable="w14 w15 w16se w16cid wp14">
+<w:numbering xmlns:wpc="http://schemas.microsoft.com/office/word/2010/wordprocessingCanvas" xmlns:cx="http://schemas.microsoft.com/office/drawing/2014/chartex" xmlns:cx1="http://schemas.microsoft.com/office/drawing/2015/9/8/chartex" xmlns:cx2="http://schemas.microsoft.com/office/drawing/2015/10/21/chartex" xmlns:cx3="http://schemas.microsoft.com/office/drawing/2016/5/9/chartex" xmlns:cx4="http://schemas.microsoft.com/office/drawing/2016/5/10/chartex" xmlns:cx5="http://schemas.microsoft.com/office/drawing/2016/5/11/chartex" xmlns:cx6="http://schemas.microsoft.com/office/drawing/2016/5/12/chartex" xmlns:cx7="http://schemas.microsoft.com/office/drawing/2016/5/13/chartex" xmlns:cx8="http://schemas.microsoft.com/office/drawing/2016/5/14/chartex" xmlns:mc="http://schemas.openxmlformats.org/markup-compatibility/2006" xmlns:aink="http://schemas.microsoft.com/office/drawing/2016/ink" xmlns:am3d="http://schemas.microsoft.com/office/drawing/2017/model3d" xmlns:o="urn:schemas-microsoft-com:office:office" xmlns:oel="http://schemas.microsoft.com/office/2019/extlst" xmlns:r="http://schemas.openxmlformats.org/officeDocument/2006/relationships" xmlns:m="http://schemas.openxmlformats.org/officeDocument/2006/math" xmlns:v="urn:schemas-microsoft-com:vml" xmlns:wp14="http://schemas.microsoft.com/office/word/2010/wordprocessingDrawing" xmlns:wp="http://schemas.openxmlformats.org/drawingml/2006/wordprocessingDrawing" xmlns:w10="urn:schemas-microsoft-com:office:word" xmlns:w="http://schemas.openxmlformats.org/wordprocessingml/2006/main" xmlns:w14="http://schemas.microsoft.com/office/word/2010/wordml" xmlns:w15="http://schemas.microsoft.com/office/word/2012/wordml" xmlns:w16cex="http://schemas.microsoft.com/office/word/2018/wordml/cex" xmlns:w16cid="http://schemas.microsoft.com/office/word/2016/wordml/cid" xmlns:w16="http://schemas.microsoft.com/office/word/2018/wordml" xmlns:w16du="http://schemas.microsoft.com/office/word/2023/wordml/word16du" xmlns:w16sdtdh="http://schemas.microsoft.com/office/word/2020/wordml/sdtdatahash" xmlns:w16sdtfl="http://schemas.microsoft.com/office/word/2024/wordml/sdtformatlock" xmlns:w16se="http://schemas.microsoft.com/office/word/2015/wordml/symex" xmlns:wpg="http://schemas.microsoft.com/office/word/2010/wordprocessingGroup" xmlns:wpi="http://schemas.microsoft.com/office/word/2010/wordprocessingInk" xmlns:wne="http://schemas.microsoft.com/office/word/2006/wordml" xmlns:wps="http://schemas.microsoft.com/office/word/2010/wordprocessingShape" mc:Ignorable="w14 w15 w16se w16cid w16 w16cex w16sdtdh w16sdtfl w16du wp14">
   <w:abstractNum w:abstractNumId="0" w15:restartNumberingAfterBreak="0">
     <w:nsid w:val="05C0479B"/>
     <w:multiLevelType w:val="hybridMultilevel"/>
@@ -13367,101 +13300,101 @@
       </w:rPr>
     </w:lvl>
   </w:abstractNum>
-  <w:num w:numId="1">
+  <w:num w:numId="1" w16cid:durableId="558980699">
     <w:abstractNumId w:val="21"/>
   </w:num>
-  <w:num w:numId="2">
+  <w:num w:numId="2" w16cid:durableId="177744663">
     <w:abstractNumId w:val="7"/>
   </w:num>
-  <w:num w:numId="3">
+  <w:num w:numId="3" w16cid:durableId="1867021064">
     <w:abstractNumId w:val="17"/>
   </w:num>
-  <w:num w:numId="4">
+  <w:num w:numId="4" w16cid:durableId="1750348206">
     <w:abstractNumId w:val="25"/>
   </w:num>
-  <w:num w:numId="5">
+  <w:num w:numId="5" w16cid:durableId="130101374">
     <w:abstractNumId w:val="1"/>
   </w:num>
-  <w:num w:numId="6">
+  <w:num w:numId="6" w16cid:durableId="1017149951">
     <w:abstractNumId w:val="13"/>
   </w:num>
-  <w:num w:numId="7">
+  <w:num w:numId="7" w16cid:durableId="1164122868">
     <w:abstractNumId w:val="0"/>
   </w:num>
-  <w:num w:numId="8">
+  <w:num w:numId="8" w16cid:durableId="520556870">
     <w:abstractNumId w:val="10"/>
   </w:num>
-  <w:num w:numId="9">
+  <w:num w:numId="9" w16cid:durableId="788815966">
     <w:abstractNumId w:val="29"/>
   </w:num>
-  <w:num w:numId="10">
+  <w:num w:numId="10" w16cid:durableId="498079817">
     <w:abstractNumId w:val="24"/>
   </w:num>
-  <w:num w:numId="11">
+  <w:num w:numId="11" w16cid:durableId="889609266">
     <w:abstractNumId w:val="26"/>
   </w:num>
-  <w:num w:numId="12">
+  <w:num w:numId="12" w16cid:durableId="635112333">
     <w:abstractNumId w:val="15"/>
   </w:num>
-  <w:num w:numId="13">
+  <w:num w:numId="13" w16cid:durableId="995887513">
     <w:abstractNumId w:val="2"/>
   </w:num>
-  <w:num w:numId="14">
+  <w:num w:numId="14" w16cid:durableId="2095278383">
     <w:abstractNumId w:val="28"/>
   </w:num>
-  <w:num w:numId="15">
+  <w:num w:numId="15" w16cid:durableId="1688360545">
     <w:abstractNumId w:val="11"/>
   </w:num>
-  <w:num w:numId="16">
+  <w:num w:numId="16" w16cid:durableId="777339078">
     <w:abstractNumId w:val="16"/>
   </w:num>
-  <w:num w:numId="17">
+  <w:num w:numId="17" w16cid:durableId="1859538477">
     <w:abstractNumId w:val="8"/>
   </w:num>
-  <w:num w:numId="18">
+  <w:num w:numId="18" w16cid:durableId="1608852286">
     <w:abstractNumId w:val="20"/>
   </w:num>
-  <w:num w:numId="19">
+  <w:num w:numId="19" w16cid:durableId="1329089220">
     <w:abstractNumId w:val="14"/>
   </w:num>
-  <w:num w:numId="20">
+  <w:num w:numId="20" w16cid:durableId="2091390426">
     <w:abstractNumId w:val="6"/>
   </w:num>
-  <w:num w:numId="21">
+  <w:num w:numId="21" w16cid:durableId="438720499">
     <w:abstractNumId w:val="19"/>
   </w:num>
-  <w:num w:numId="22">
+  <w:num w:numId="22" w16cid:durableId="72433251">
     <w:abstractNumId w:val="3"/>
   </w:num>
-  <w:num w:numId="23">
+  <w:num w:numId="23" w16cid:durableId="1248734335">
     <w:abstractNumId w:val="27"/>
   </w:num>
-  <w:num w:numId="24">
+  <w:num w:numId="24" w16cid:durableId="514348981">
     <w:abstractNumId w:val="12"/>
   </w:num>
-  <w:num w:numId="25">
+  <w:num w:numId="25" w16cid:durableId="701325520">
     <w:abstractNumId w:val="22"/>
   </w:num>
-  <w:num w:numId="26">
+  <w:num w:numId="26" w16cid:durableId="549339971">
     <w:abstractNumId w:val="18"/>
   </w:num>
-  <w:num w:numId="27">
+  <w:num w:numId="27" w16cid:durableId="1240021104">
     <w:abstractNumId w:val="9"/>
   </w:num>
-  <w:num w:numId="28">
+  <w:num w:numId="28" w16cid:durableId="122232224">
     <w:abstractNumId w:val="23"/>
   </w:num>
-  <w:num w:numId="29">
+  <w:num w:numId="29" w16cid:durableId="1753618701">
     <w:abstractNumId w:val="4"/>
   </w:num>
-  <w:num w:numId="30">
+  <w:num w:numId="30" w16cid:durableId="181435531">
     <w:abstractNumId w:val="5"/>
   </w:num>
 </w:numbering>
 </file>
 
 <file path=word/styles.xml><?xml version="1.0" encoding="utf-8"?>
-<w:styles xmlns:mc="http://schemas.openxmlformats.org/markup-compatibility/2006" xmlns:r="http://schemas.openxmlformats.org/officeDocument/2006/relationships" xmlns:w="http://schemas.openxmlformats.org/wordprocessingml/2006/main" xmlns:w14="http://schemas.microsoft.com/office/word/2010/wordml" xmlns:w15="http://schemas.microsoft.com/office/word/2012/wordml" xmlns:w16cid="http://schemas.microsoft.com/office/word/2016/wordml/cid" xmlns:w16se="http://schemas.microsoft.com/office/word/2015/wordml/symex" mc:Ignorable="w14 w15 w16se w16cid">
+<w:styles xmlns:mc="http://schemas.openxmlformats.org/markup-compatibility/2006" xmlns:r="http://schemas.openxmlformats.org/officeDocument/2006/relationships" xmlns:w="http://schemas.openxmlformats.org/wordprocessingml/2006/main" xmlns:w14="http://schemas.microsoft.com/office/word/2010/wordml" xmlns:w15="http://schemas.microsoft.com/office/word/2012/wordml" xmlns:w16cex="http://schemas.microsoft.com/office/word/2018/wordml/cex" xmlns:w16cid="http://schemas.microsoft.com/office/word/2016/wordml/cid" xmlns:w16="http://schemas.microsoft.com/office/word/2018/wordml" xmlns:w16du="http://schemas.microsoft.com/office/word/2023/wordml/word16du" xmlns:w16sdtdh="http://schemas.microsoft.com/office/word/2020/wordml/sdtdatahash" xmlns:w16sdtfl="http://schemas.microsoft.com/office/word/2024/wordml/sdtformatlock" xmlns:w16se="http://schemas.microsoft.com/office/word/2015/wordml/symex" mc:Ignorable="w14 w15 w16se w16cid w16 w16cex w16sdtdh w16sdtfl w16du">
   <w:docDefaults>
     <w:rPrDefault>
       <w:rPr>
@@ -13483,7 +13416,7 @@
       </w:pPr>
     </w:pPrDefault>
   </w:docDefaults>
-  <w:latentStyles w:defLockedState="0" w:defUIPriority="99" w:defSemiHidden="0" w:defUnhideWhenUsed="0" w:defQFormat="0" w:count="375">
+  <w:latentStyles w:defLockedState="0" w:defUIPriority="99" w:defSemiHidden="0" w:defUnhideWhenUsed="0" w:defQFormat="0" w:count="376">
     <w:lsdException w:name="Normal" w:uiPriority="0" w:qFormat="1"/>
     <w:lsdException w:name="heading 1" w:uiPriority="9" w:qFormat="1"/>
     <w:lsdException w:name="heading 2" w:semiHidden="1" w:uiPriority="9" w:unhideWhenUsed="1" w:qFormat="1"/>
@@ -13859,6 +13792,7 @@
     <w:lsdException w:name="Smart Hyperlink" w:semiHidden="1" w:unhideWhenUsed="1"/>
     <w:lsdException w:name="Hashtag" w:semiHidden="1" w:unhideWhenUsed="1"/>
     <w:lsdException w:name="Unresolved Mention" w:semiHidden="1" w:unhideWhenUsed="1"/>
+    <w:lsdException w:name="Smart Link" w:semiHidden="1" w:unhideWhenUsed="1"/>
   </w:latentStyles>
   <w:style w:type="paragraph" w:default="1" w:styleId="Normal">
     <w:name w:val="Normal"/>
@@ -13871,7 +13805,6 @@
   <w:style w:type="character" w:default="1" w:styleId="DefaultParagraphFont">
     <w:name w:val="Default Paragraph Font"/>
     <w:uiPriority w:val="1"/>
-    <w:semiHidden/>
     <w:unhideWhenUsed/>
   </w:style>
   <w:style w:type="table" w:default="1" w:styleId="TableNormal">

</xml_diff>